<commit_message>
Fix refining for modded ores
</commit_message>
<xml_diff>
--- a/WSEE-0.1.0-Minecraft-26.3-Fabric-NeoForge-详细规格.docx
+++ b/WSEE-0.1.0-Minecraft-26.3-Fabric-NeoForge-详细规格.docx
@@ -20342,7 +20342,7 @@
           <w:color w:val="222222"/>
           <w:sz w:val="21"/>
         </w:rPr>
-        <w:t>中文名称：炼化；英文名称：Refining；附魔 ID：wsee:refining。适用装备：镐；最高等级：I。挖掘铁、金、铜矿石时直接掉落对应矿物锭，不经过粗矿阶段。</w:t>
+        <w:t>中文名称：炼化；英文名称：Refining；附魔 ID：wsee:refining。适用装备：镐；最高等级：I。挖掘带有矿石标签且存在熔炼配方的矿石时，直接掉落对应熔炼产物，不经过熔炼炉阶段。</w:t>
       </w:r>
     </w:p>
     <w:p>
@@ -20480,7 +20480,7 @@
                 <w:color w:val="222222"/>
                 <w:sz w:val="17"/>
               </w:rPr>
-              <w:t>铁矿石→铁锭；金矿石→金锭；铜矿石→铜锭；保持原掉落数量与 Fortune 倍数</w:t>
+              <w:t>原版铁、金、铜及其他模组矿石按其熔炼配方输出；保持原掉落数量与 Fortune 倍数</w:t>
             </w:r>
           </w:p>
         </w:tc>
@@ -20517,7 +20517,7 @@
           <w:color w:val="222222"/>
           <w:sz w:val="20"/>
         </w:rPr>
-        <w:t>只处理 wsee:refinable_ores 标签内的矿石；精准采集等非法组合仍由数据、铁砧、附魔台和运行时共同拒绝。</w:t>
+        <w:t>只处理 wsee:refinable_ores 标签内且能匹配熔炼配方的矿石；兼容 minecraft:ores、c:ores 和 forge:ores 标签，精准采集等非法组合仍由数据、铁砧、附魔台和运行时共同拒绝。</w:t>
       </w:r>
     </w:p>
     <w:p>
@@ -20545,7 +20545,7 @@
           <w:color w:val="222222"/>
           <w:sz w:val="20"/>
         </w:rPr>
-        <w:t>不额外产生熔炼经验；掉落表现保持原版掉落事件。</w:t>
+        <w:t>不额外生成熔炼经验；掉落表现保持原版掉落事件。</w:t>
       </w:r>
     </w:p>
     <w:p>

</xml_diff>